<commit_message>
WIP snapshot before chat merge (2026-10-17)
</commit_message>
<xml_diff>
--- a/tmp_export_single.docx
+++ b/tmp_export_single.docx
@@ -4,51 +4,918 @@
   <w:body>
     <w:p>
       <w:pPr>
-        <w:pStyle w:val="Title"/>
+        <w:spacing w:before="680" w:after="0" w:line="240" w:lineRule="auto"/>
+      </w:pPr>
+      <w:r>
+        <w:rPr>
+          <w:rFonts w:ascii="Times New Roman" w:hAnsi="Times New Roman" w:eastAsia="宋体"/>
+          <w:b w:val="0"/>
+          <w:sz w:val="2"/>
+        </w:rPr>
+      </w:r>
+    </w:p>
+    <w:p>
+      <w:pPr>
+        <w:spacing w:after="360" w:line="312" w:lineRule="auto"/>
         <w:jc w:val="center"/>
       </w:pPr>
       <w:r>
         <w:rPr>
-          <w:rFonts w:ascii="微软雅黑" w:hAnsi="微软雅黑"/>
+          <w:rFonts w:ascii="Times New Roman" w:hAnsi="Times New Roman" w:eastAsia="黑体"/>
           <w:b/>
-          <w:color w:val="667EEA"/>
-          <w:sz w:val="40"/>
+          <w:sz w:val="72"/>
         </w:rPr>
-        <w:t>????</w:t>
-      </w:r>
-    </w:p>
-    <w:p/>
-    <w:p>
-      <w:pPr>
-        <w:pStyle w:val="Heading2"/>
-      </w:pPr>
-      <w:r>
-        <w:rPr>
-          <w:rFonts w:ascii="微软雅黑" w:hAnsi="微软雅黑"/>
-          <w:b/>
-          <w:color w:val="4A55B8"/>
-          <w:sz w:val="28"/>
-        </w:rPr>
-        <w:t>??????</w:t>
+        <w:t>面向学生群体的AI一键PPT生成网页，搭载合规商用素材库，快速制作演示文档。</w:t>
       </w:r>
     </w:p>
     <w:p>
       <w:pPr>
-        <w:spacing w:line="360" w:lineRule="auto" w:after="120"/>
-        <w:ind w:firstLine="420"/>
+        <w:spacing w:after="200" w:line="312" w:lineRule="auto"/>
+        <w:jc w:val="center"/>
       </w:pPr>
       <w:r>
-        <w:t>????</w:t>
+        <w:rPr>
+          <w:rFonts w:ascii="Times New Roman" w:hAnsi="Times New Roman" w:eastAsia="黑体"/>
+          <w:b w:val="0"/>
+          <w:sz w:val="44"/>
+        </w:rPr>
+        <w:t>中国国际互联网+大学生创新创业大赛</w:t>
+      </w:r>
+    </w:p>
+    <w:p>
+      <w:pPr>
+        <w:spacing w:line="360" w:lineRule="auto"/>
+        <w:jc w:val="center"/>
+      </w:pPr>
+      <w:r>
+        <w:rPr>
+          <w:rFonts w:ascii="Times New Roman" w:hAnsi="Times New Roman" w:eastAsia="黑体"/>
+          <w:b w:val="0"/>
+          <w:sz w:val="30"/>
+        </w:rPr>
+        <w:t>2026 年 10 月 01 日</w:t>
+      </w:r>
+    </w:p>
+    <w:p>
+      <w:r>
+        <w:br w:type="page"/>
+      </w:r>
+    </w:p>
+    <w:p>
+      <w:pPr>
+        <w:spacing w:after="320"/>
+        <w:jc w:val="center"/>
+      </w:pPr>
+      <w:r>
+        <w:rPr>
+          <w:rFonts w:ascii="Times New Roman" w:hAnsi="Times New Roman" w:eastAsia="黑体"/>
+          <w:b/>
+          <w:sz w:val="44"/>
+        </w:rPr>
+        <w:t>目  录</w:t>
+      </w:r>
+    </w:p>
+    <w:p>
+      <w:pPr>
+        <w:spacing w:after="60" w:line="336" w:lineRule="auto"/>
+        <w:ind w:left="0"/>
+        <w:tabs>
+          <w:tab w:val="right" w:leader="dot" w:pos="9060"/>
+        </w:tabs>
+      </w:pPr>
+      <w:r>
+        <w:rPr>
+          <w:rFonts w:ascii="Times New Roman" w:hAnsi="Times New Roman" w:eastAsia="黑体"/>
+          <w:b/>
+          <w:sz w:val="24"/>
+        </w:rPr>
+        <w:t>一、分阶段计划（8周）</w:t>
+      </w:r>
+    </w:p>
+    <w:p>
+      <w:pPr>
+        <w:spacing w:after="60" w:line="336" w:lineRule="auto"/>
+        <w:ind w:left="0"/>
+        <w:tabs>
+          <w:tab w:val="right" w:leader="dot" w:pos="9060"/>
+        </w:tabs>
+      </w:pPr>
+      <w:r>
+        <w:rPr>
+          <w:rFonts w:ascii="Times New Roman" w:hAnsi="Times New Roman" w:eastAsia="黑体"/>
+          <w:b/>
+          <w:sz w:val="24"/>
+        </w:rPr>
+        <w:t>二、里程碑与验收标准</w:t>
+      </w:r>
+    </w:p>
+    <w:p>
+      <w:pPr>
+        <w:spacing w:after="60" w:line="336" w:lineRule="auto"/>
+        <w:ind w:left="0"/>
+        <w:tabs>
+          <w:tab w:val="right" w:leader="dot" w:pos="9060"/>
+        </w:tabs>
+      </w:pPr>
+      <w:r>
+        <w:rPr>
+          <w:rFonts w:ascii="Times New Roman" w:hAnsi="Times New Roman" w:eastAsia="黑体"/>
+          <w:b/>
+          <w:sz w:val="24"/>
+        </w:rPr>
+        <w:t>三、团队分工</w:t>
+      </w:r>
+    </w:p>
+    <w:p>
+      <w:pPr>
+        <w:spacing w:after="60" w:line="336" w:lineRule="auto"/>
+        <w:ind w:left="0"/>
+        <w:tabs>
+          <w:tab w:val="right" w:leader="dot" w:pos="9060"/>
+        </w:tabs>
+      </w:pPr>
+      <w:r>
+        <w:rPr>
+          <w:rFonts w:ascii="Times New Roman" w:hAnsi="Times New Roman" w:eastAsia="黑体"/>
+          <w:b/>
+          <w:sz w:val="24"/>
+        </w:rPr>
+        <w:t>四、风险预案</w:t>
+      </w:r>
+    </w:p>
+    <w:p>
+      <w:r>
+        <w:br w:type="page"/>
+      </w:r>
+    </w:p>
+    <w:p>
+      <w:bookmarkStart w:id="1001" w:name="_toc_1"/>
+      <w:pPr>
+        <w:pStyle w:val="Heading1"/>
+        <w:keepNext w:val="0"/>
+        <w:spacing w:before="200" w:after="80" w:line="360" w:lineRule="auto"/>
+        <w:jc w:val="left"/>
+      </w:pPr>
+      <w:r>
+        <w:rPr>
+          <w:rFonts w:ascii="Times New Roman" w:hAnsi="Times New Roman" w:eastAsia="黑体"/>
+          <w:b/>
+          <w:sz w:val="44"/>
+        </w:rPr>
+        <w:t>一、分阶段计划（8周）</w:t>
+      </w:r>
+      <w:bookmarkEnd w:id="1001"/>
+    </w:p>
+    <w:p>
+      <w:pPr>
+        <w:spacing w:line="360" w:lineRule="auto" w:before="0" w:after="0"/>
+        <w:jc w:val="both"/>
+        <w:ind w:firstLineChars="200"/>
+      </w:pPr>
+      <w:r>
+        <w:rPr>
+          <w:rFonts w:ascii="Times New Roman" w:hAnsi="Times New Roman" w:eastAsia="宋体"/>
+          <w:b w:val="0"/>
+          <w:sz w:val="24"/>
+        </w:rPr>
+        <w:t>这个项目要解决的事很具体：学生做演示文档，找模板花时间、配图怕侵权、排版反复调。平台把这三件事压进一条流程——填创意、选模板、出初稿，素材全部来自合规商用库。某高校完后勤处，内测阶段有效样本860条（实测值），这组数据是后面所有迭代判断的基准。</w:t>
+      </w:r>
+    </w:p>
+    <w:p>
+      <w:pPr>
+        <w:spacing w:line="360" w:lineRule="auto" w:before="0" w:after="0"/>
+        <w:jc w:val="both"/>
+        <w:ind w:firstLineChars="200"/>
+      </w:pPr>
+      <w:r>
+        <w:rPr>
+          <w:rFonts w:ascii="Times New Roman" w:hAnsi="Times New Roman" w:eastAsia="宋体"/>
+          <w:b w:val="0"/>
+          <w:sz w:val="24"/>
+        </w:rPr>
+        <w:t>周次</w:t>
+      </w:r>
+    </w:p>
+    <w:p>
+      <w:pPr>
+        <w:spacing w:line="360" w:lineRule="auto" w:before="0" w:after="0"/>
+        <w:jc w:val="both"/>
+        <w:ind w:firstLineChars="200"/>
+      </w:pPr>
+      <w:r>
+        <w:rPr>
+          <w:rFonts w:ascii="Times New Roman" w:hAnsi="Times New Roman" w:eastAsia="宋体"/>
+          <w:b w:val="0"/>
+          <w:sz w:val="24"/>
+        </w:rPr>
+        <w:t>核心任务</w:t>
+      </w:r>
+    </w:p>
+    <w:p>
+      <w:pPr>
+        <w:spacing w:line="360" w:lineRule="auto" w:before="0" w:after="0"/>
+        <w:jc w:val="both"/>
+        <w:ind w:firstLineChars="200"/>
+      </w:pPr>
+      <w:r>
+        <w:rPr>
+          <w:rFonts w:ascii="Times New Roman" w:hAnsi="Times New Roman" w:eastAsia="宋体"/>
+          <w:b w:val="0"/>
+          <w:sz w:val="24"/>
+        </w:rPr>
+        <w:t>交付成果</w:t>
+      </w:r>
+    </w:p>
+    <w:p>
+      <w:pPr>
+        <w:spacing w:line="360" w:lineRule="auto" w:before="0" w:after="0"/>
+        <w:jc w:val="both"/>
+        <w:ind w:firstLineChars="200"/>
+      </w:pPr>
+      <w:r>
+        <w:rPr>
+          <w:rFonts w:ascii="Times New Roman" w:hAnsi="Times New Roman" w:eastAsia="宋体"/>
+          <w:b w:val="0"/>
+          <w:sz w:val="24"/>
+        </w:rPr>
+        <w:t>第1周</w:t>
+      </w:r>
+    </w:p>
+    <w:p>
+      <w:pPr>
+        <w:spacing w:line="360" w:lineRule="auto" w:before="0" w:after="0"/>
+        <w:jc w:val="both"/>
+        <w:ind w:firstLineChars="200"/>
+      </w:pPr>
+      <w:r>
+        <w:rPr>
+          <w:rFonts w:ascii="Times New Roman" w:hAnsi="Times New Roman" w:eastAsia="宋体"/>
+          <w:b w:val="0"/>
+          <w:sz w:val="24"/>
+        </w:rPr>
+        <w:t>需求收敛与素材库选型</w:t>
+      </w:r>
+    </w:p>
+    <w:p>
+      <w:pPr>
+        <w:spacing w:line="360" w:lineRule="auto" w:before="0" w:after="0"/>
+        <w:jc w:val="both"/>
+        <w:ind w:firstLineChars="200"/>
+      </w:pPr>
+      <w:r>
+        <w:rPr>
+          <w:rFonts w:ascii="Times New Roman" w:hAnsi="Times New Roman" w:eastAsia="宋体"/>
+          <w:b w:val="0"/>
+          <w:sz w:val="24"/>
+        </w:rPr>
+        <w:t>需求清单、素材库授权方案</w:t>
+      </w:r>
+    </w:p>
+    <w:p>
+      <w:pPr>
+        <w:spacing w:line="360" w:lineRule="auto" w:before="0" w:after="0"/>
+        <w:jc w:val="both"/>
+        <w:ind w:firstLineChars="200"/>
+      </w:pPr>
+      <w:r>
+        <w:rPr>
+          <w:rFonts w:ascii="Times New Roman" w:hAnsi="Times New Roman" w:eastAsia="宋体"/>
+          <w:b w:val="0"/>
+          <w:sz w:val="24"/>
+        </w:rPr>
+        <w:t>第2周</w:t>
+      </w:r>
+    </w:p>
+    <w:p>
+      <w:pPr>
+        <w:spacing w:line="360" w:lineRule="auto" w:before="0" w:after="0"/>
+        <w:jc w:val="both"/>
+        <w:ind w:firstLineChars="200"/>
+      </w:pPr>
+      <w:r>
+        <w:rPr>
+          <w:rFonts w:ascii="Times New Roman" w:hAnsi="Times New Roman" w:eastAsia="宋体"/>
+          <w:b w:val="0"/>
+          <w:sz w:val="24"/>
+        </w:rPr>
+        <w:t>产品原型与技术架构</w:t>
+      </w:r>
+    </w:p>
+    <w:p>
+      <w:pPr>
+        <w:spacing w:line="360" w:lineRule="auto" w:before="0" w:after="0"/>
+        <w:jc w:val="both"/>
+        <w:ind w:firstLineChars="200"/>
+      </w:pPr>
+      <w:r>
+        <w:rPr>
+          <w:rFonts w:ascii="Times New Roman" w:hAnsi="Times New Roman" w:eastAsia="宋体"/>
+          <w:b w:val="0"/>
+          <w:sz w:val="24"/>
+        </w:rPr>
+        <w:t>可点击原型、架构文档</w:t>
+      </w:r>
+    </w:p>
+    <w:p>
+      <w:pPr>
+        <w:spacing w:line="360" w:lineRule="auto" w:before="0" w:after="0"/>
+        <w:jc w:val="both"/>
+        <w:ind w:firstLineChars="200"/>
+      </w:pPr>
+      <w:r>
+        <w:rPr>
+          <w:rFonts w:ascii="Times New Roman" w:hAnsi="Times New Roman" w:eastAsia="宋体"/>
+          <w:b w:val="0"/>
+          <w:sz w:val="24"/>
+        </w:rPr>
+        <w:t>第3周</w:t>
+      </w:r>
+    </w:p>
+    <w:p>
+      <w:pPr>
+        <w:spacing w:line="360" w:lineRule="auto" w:before="0" w:after="0"/>
+        <w:jc w:val="both"/>
+        <w:ind w:firstLineChars="200"/>
+      </w:pPr>
+      <w:r>
+        <w:rPr>
+          <w:rFonts w:ascii="Times New Roman" w:hAnsi="Times New Roman" w:eastAsia="宋体"/>
+          <w:b w:val="0"/>
+          <w:sz w:val="24"/>
+        </w:rPr>
+        <w:t>生成引擎与模板系统开发</w:t>
+      </w:r>
+    </w:p>
+    <w:p>
+      <w:pPr>
+        <w:spacing w:line="360" w:lineRule="auto" w:before="0" w:after="0"/>
+        <w:jc w:val="both"/>
+        <w:ind w:firstLineChars="200"/>
+      </w:pPr>
+      <w:r>
+        <w:rPr>
+          <w:rFonts w:ascii="Times New Roman" w:hAnsi="Times New Roman" w:eastAsia="宋体"/>
+          <w:b w:val="0"/>
+          <w:sz w:val="24"/>
+        </w:rPr>
+        <w:t>内测版生成链路</w:t>
+      </w:r>
+    </w:p>
+    <w:p>
+      <w:pPr>
+        <w:spacing w:line="360" w:lineRule="auto" w:before="0" w:after="0"/>
+        <w:jc w:val="both"/>
+        <w:ind w:firstLineChars="200"/>
+      </w:pPr>
+      <w:r>
+        <w:rPr>
+          <w:rFonts w:ascii="Times New Roman" w:hAnsi="Times New Roman" w:eastAsia="宋体"/>
+          <w:b w:val="0"/>
+          <w:sz w:val="24"/>
+        </w:rPr>
+        <w:t>第4周</w:t>
+      </w:r>
+    </w:p>
+    <w:p>
+      <w:pPr>
+        <w:spacing w:line="360" w:lineRule="auto" w:before="0" w:after="0"/>
+        <w:jc w:val="both"/>
+        <w:ind w:firstLineChars="200"/>
+      </w:pPr>
+      <w:r>
+        <w:rPr>
+          <w:rFonts w:ascii="Times New Roman" w:hAnsi="Times New Roman" w:eastAsia="宋体"/>
+          <w:b w:val="0"/>
+          <w:sz w:val="24"/>
+        </w:rPr>
+        <w:t>合规素材库接入与版权校验</w:t>
+      </w:r>
+    </w:p>
+    <w:p>
+      <w:pPr>
+        <w:spacing w:line="360" w:lineRule="auto" w:before="0" w:after="0"/>
+        <w:jc w:val="both"/>
+        <w:ind w:firstLineChars="200"/>
+      </w:pPr>
+      <w:r>
+        <w:rPr>
+          <w:rFonts w:ascii="Times New Roman" w:hAnsi="Times New Roman" w:eastAsia="宋体"/>
+          <w:b w:val="0"/>
+          <w:sz w:val="24"/>
+        </w:rPr>
+        <w:t>素材调用接口、版权台账</w:t>
+      </w:r>
+    </w:p>
+    <w:p>
+      <w:pPr>
+        <w:spacing w:line="360" w:lineRule="auto" w:before="0" w:after="0"/>
+        <w:jc w:val="both"/>
+        <w:ind w:firstLineChars="200"/>
+      </w:pPr>
+      <w:r>
+        <w:rPr>
+          <w:rFonts w:ascii="Times New Roman" w:hAnsi="Times New Roman" w:eastAsia="宋体"/>
+          <w:b w:val="0"/>
+          <w:sz w:val="24"/>
+        </w:rPr>
+        <w:t>第5周</w:t>
+      </w:r>
+    </w:p>
+    <w:p>
+      <w:pPr>
+        <w:spacing w:line="360" w:lineRule="auto" w:before="0" w:after="0"/>
+        <w:jc w:val="both"/>
+        <w:ind w:firstLineChars="200"/>
+      </w:pPr>
+      <w:r>
+        <w:rPr>
+          <w:rFonts w:ascii="Times New Roman" w:hAnsi="Times New Roman" w:eastAsia="宋体"/>
+          <w:b w:val="0"/>
+          <w:sz w:val="24"/>
+        </w:rPr>
+        <w:t>内测上线（四川商学院完后勤处场景）</w:t>
+      </w:r>
+    </w:p>
+    <w:p>
+      <w:pPr>
+        <w:spacing w:line="360" w:lineRule="auto" w:before="0" w:after="0"/>
+        <w:jc w:val="both"/>
+        <w:ind w:firstLineChars="200"/>
+      </w:pPr>
+      <w:r>
+        <w:rPr>
+          <w:rFonts w:ascii="Times New Roman" w:hAnsi="Times New Roman" w:eastAsia="宋体"/>
+          <w:b w:val="0"/>
+          <w:sz w:val="24"/>
+        </w:rPr>
+        <w:t>860条有效样本回收（实测值）</w:t>
+      </w:r>
+    </w:p>
+    <w:p>
+      <w:pPr>
+        <w:spacing w:line="360" w:lineRule="auto" w:before="0" w:after="0"/>
+        <w:jc w:val="both"/>
+        <w:ind w:firstLineChars="200"/>
+      </w:pPr>
+      <w:r>
+        <w:rPr>
+          <w:rFonts w:ascii="Times New Roman" w:hAnsi="Times New Roman" w:eastAsia="宋体"/>
+          <w:b w:val="0"/>
+          <w:sz w:val="24"/>
+        </w:rPr>
+        <w:t>第6周</w:t>
+      </w:r>
+    </w:p>
+    <w:p>
+      <w:pPr>
+        <w:spacing w:line="360" w:lineRule="auto" w:before="0" w:after="0"/>
+        <w:jc w:val="both"/>
+        <w:ind w:firstLineChars="200"/>
+      </w:pPr>
+      <w:r>
+        <w:rPr>
+          <w:rFonts w:ascii="Times New Roman" w:hAnsi="Times New Roman" w:eastAsia="宋体"/>
+          <w:b w:val="0"/>
+          <w:sz w:val="24"/>
+        </w:rPr>
+        <w:t>数据分析与迭代</w:t>
+      </w:r>
+    </w:p>
+    <w:p>
+      <w:pPr>
+        <w:spacing w:line="360" w:lineRule="auto" w:before="0" w:after="0"/>
+        <w:jc w:val="both"/>
+        <w:ind w:firstLineChars="200"/>
+      </w:pPr>
+      <w:r>
+        <w:rPr>
+          <w:rFonts w:ascii="Times New Roman" w:hAnsi="Times New Roman" w:eastAsia="宋体"/>
+          <w:b w:val="0"/>
+          <w:sz w:val="24"/>
+        </w:rPr>
+        <w:t>迭代清单、第二版</w:t>
+      </w:r>
+    </w:p>
+    <w:p>
+      <w:pPr>
+        <w:spacing w:line="360" w:lineRule="auto" w:before="0" w:after="0"/>
+        <w:jc w:val="both"/>
+        <w:ind w:firstLineChars="200"/>
+      </w:pPr>
+      <w:r>
+        <w:rPr>
+          <w:rFonts w:ascii="Times New Roman" w:hAnsi="Times New Roman" w:eastAsia="宋体"/>
+          <w:b w:val="0"/>
+          <w:sz w:val="24"/>
+        </w:rPr>
+        <w:t>第7周</w:t>
+      </w:r>
+    </w:p>
+    <w:p>
+      <w:pPr>
+        <w:spacing w:line="360" w:lineRule="auto" w:before="0" w:after="0"/>
+        <w:jc w:val="both"/>
+        <w:ind w:firstLineChars="200"/>
+      </w:pPr>
+      <w:r>
+        <w:rPr>
+          <w:rFonts w:ascii="Times New Roman" w:hAnsi="Times New Roman" w:eastAsia="宋体"/>
+          <w:b w:val="0"/>
+          <w:sz w:val="24"/>
+        </w:rPr>
+        <w:t>渠道对接与定价验证</w:t>
+      </w:r>
+    </w:p>
+    <w:p>
+      <w:pPr>
+        <w:spacing w:line="360" w:lineRule="auto" w:before="0" w:after="0"/>
+        <w:jc w:val="both"/>
+        <w:ind w:firstLineChars="200"/>
+      </w:pPr>
+      <w:r>
+        <w:rPr>
+          <w:rFonts w:ascii="Times New Roman" w:hAnsi="Times New Roman" w:eastAsia="宋体"/>
+          <w:b w:val="0"/>
+          <w:sz w:val="24"/>
+        </w:rPr>
+        <w:t>定价方案、渠道协议草案</w:t>
+      </w:r>
+    </w:p>
+    <w:p>
+      <w:pPr>
+        <w:spacing w:line="360" w:lineRule="auto" w:before="0" w:after="0"/>
+        <w:jc w:val="both"/>
+        <w:ind w:firstLineChars="200"/>
+      </w:pPr>
+      <w:r>
+        <w:rPr>
+          <w:rFonts w:ascii="Times New Roman" w:hAnsi="Times New Roman" w:eastAsia="宋体"/>
+          <w:b w:val="0"/>
+          <w:sz w:val="24"/>
+        </w:rPr>
+        <w:t>第8周</w:t>
+      </w:r>
+    </w:p>
+    <w:p>
+      <w:pPr>
+        <w:spacing w:line="360" w:lineRule="auto" w:before="0" w:after="0"/>
+        <w:jc w:val="both"/>
+        <w:ind w:firstLineChars="200"/>
+      </w:pPr>
+      <w:r>
+        <w:rPr>
+          <w:rFonts w:ascii="Times New Roman" w:hAnsi="Times New Roman" w:eastAsia="宋体"/>
+          <w:b w:val="0"/>
+          <w:sz w:val="24"/>
+        </w:rPr>
+        <w:t>收尾与答辩材料</w:t>
+      </w:r>
+    </w:p>
+    <w:p>
+      <w:pPr>
+        <w:spacing w:line="360" w:lineRule="auto" w:before="0" w:after="0"/>
+        <w:jc w:val="both"/>
+        <w:ind w:firstLineChars="200"/>
+      </w:pPr>
+      <w:r>
+        <w:rPr>
+          <w:rFonts w:ascii="Times New Roman" w:hAnsi="Times New Roman" w:eastAsia="宋体"/>
+          <w:b w:val="0"/>
+          <w:sz w:val="24"/>
+        </w:rPr>
+        <w:t>演示文档、财务测算表</w:t>
+      </w:r>
+    </w:p>
+    <w:p>
+      <w:pPr>
+        <w:spacing w:line="360" w:lineRule="auto" w:before="0" w:after="0"/>
+        <w:jc w:val="both"/>
+        <w:ind w:firstLineChars="200"/>
+      </w:pPr>
+      <w:r>
+        <w:rPr>
+          <w:rFonts w:ascii="Times New Roman" w:hAnsi="Times New Roman" w:eastAsia="宋体"/>
+          <w:b w:val="0"/>
+          <w:sz w:val="24"/>
+        </w:rPr>
+        <w:t>第1到第2周是打地基。需某高校完后勤处的场景访谈，把「学生做PPT卡在哪一步」问清楚；素材库侧要确认授权范围，商用授权必须能覆盖教育场景，这一步没落实，后面全部返工。第3到第4周进入开发，生成引擎先跑通「创意→大纲→成稿」主链路，素材库以接口形式接入，每张素材带授权编号，版权校验做成自动拦截。第5周内测，860条有效样本（实测值）是这个阶段的核心产出，样本量足够支撑分层分析——按文档类型、按完成度、按放弃节点切。第6周拿数据说话，哪一步流失高就改哪一步。第7周开始碰商业侧，渠道和定价不能等到最后才想。第8周收口，把过程材料整理成可答辩的形态。</w:t>
+      </w:r>
+    </w:p>
+    <w:p>
+      <w:bookmarkStart w:id="1002" w:name="_toc_2"/>
+      <w:pPr>
+        <w:pStyle w:val="Heading1"/>
+        <w:keepNext w:val="0"/>
+        <w:spacing w:before="200" w:after="80" w:line="360" w:lineRule="auto"/>
+        <w:jc w:val="left"/>
+      </w:pPr>
+      <w:r>
+        <w:rPr>
+          <w:rFonts w:ascii="Times New Roman" w:hAnsi="Times New Roman" w:eastAsia="黑体"/>
+          <w:b/>
+          <w:sz w:val="44"/>
+        </w:rPr>
+        <w:t>二、里程碑与验收标准</w:t>
+      </w:r>
+      <w:bookmarkEnd w:id="1002"/>
+    </w:p>
+    <w:p>
+      <w:pPr>
+        <w:spacing w:line="360" w:lineRule="auto" w:before="0" w:after="0"/>
+        <w:jc w:val="both"/>
+        <w:ind w:firstLineChars="200"/>
+      </w:pPr>
+      <w:r>
+        <w:rPr>
+          <w:rFonts w:ascii="Times New Roman" w:hAnsi="Times New Roman" w:eastAsia="宋体"/>
+          <w:b w:val="0"/>
+          <w:sz w:val="24"/>
+        </w:rPr>
+        <w:t>第2周末的里程碑是原型冻结。验收看三条：原型能完整走通一次生成流程；架构文档写明生成引擎、素材库、版权校验三者的调用关系；需求清单里每条都能对应到具体功能点，没有悬空项。</w:t>
+      </w:r>
+    </w:p>
+    <w:p>
+      <w:pPr>
+        <w:spacing w:line="360" w:lineRule="auto" w:before="0" w:after="0"/>
+        <w:jc w:val="both"/>
+        <w:ind w:firstLineChars="200"/>
+      </w:pPr>
+      <w:r>
+        <w:rPr>
+          <w:rFonts w:ascii="Times New Roman" w:hAnsi="Times New Roman" w:eastAsia="宋体"/>
+          <w:b w:val="0"/>
+          <w:sz w:val="24"/>
+        </w:rPr>
+        <w:t>第4周末的里程碑是内测版可用。验收标准是可生成不少于5类演示文档，素材库调用成功率不低于95%（设计目标值），版权校验对未授权素材的拦截率100%。这个拦截率是硬指标，放过去一张侵权图，整个项目的合规前提就塌了。</w:t>
+      </w:r>
+    </w:p>
+    <w:p>
+      <w:pPr>
+        <w:spacing w:line="360" w:lineRule="auto" w:before="0" w:after="0"/>
+        <w:jc w:val="both"/>
+        <w:ind w:firstLineChars="200"/>
+      </w:pPr>
+      <w:r>
+        <w:rPr>
+          <w:rFonts w:ascii="Times New Roman" w:hAnsi="Times New Roman" w:eastAsia="宋体"/>
+          <w:b w:val="0"/>
+          <w:sz w:val="24"/>
+        </w:rPr>
+        <w:t>第5周末的里程碑是内测完成。验收看有效样本860条（实测值）是否收齐，以及样本的分布是否覆盖主要使用场景。样本收不齐就延长内测，不硬凑数。</w:t>
+      </w:r>
+    </w:p>
+    <w:p>
+      <w:pPr>
+        <w:spacing w:line="360" w:lineRule="auto" w:before="0" w:after="0"/>
+        <w:jc w:val="both"/>
+        <w:ind w:firstLineChars="200"/>
+      </w:pPr>
+      <w:r>
+        <w:rPr>
+          <w:rFonts w:ascii="Times New Roman" w:hAnsi="Times New Roman" w:eastAsia="宋体"/>
+          <w:b w:val="0"/>
+          <w:sz w:val="24"/>
+        </w:rPr>
+        <w:t>第6周末的里程碑是迭代版上线。验收标准是内测暴露的Top3问题全部有对应改动，改动后重测关键指标有提升。</w:t>
+      </w:r>
+    </w:p>
+    <w:p>
+      <w:pPr>
+        <w:spacing w:line="360" w:lineRule="auto" w:before="0" w:after="0"/>
+        <w:jc w:val="both"/>
+        <w:ind w:firstLineChars="200"/>
+      </w:pPr>
+      <w:r>
+        <w:rPr>
+          <w:rFonts w:ascii="Times New Roman" w:hAnsi="Times New Roman" w:eastAsia="宋体"/>
+          <w:b w:val="0"/>
+          <w:sz w:val="24"/>
+        </w:rPr>
+        <w:t>第8周末的里程碑是交付。验收看演示文档能否在10分钟内讲清项目全貌，财务测算表能否自洽——收入、成本、盈亏平衡点三者要对得上。</w:t>
+      </w:r>
+    </w:p>
+    <w:p>
+      <w:bookmarkStart w:id="1003" w:name="_toc_3"/>
+      <w:pPr>
+        <w:pStyle w:val="Heading1"/>
+        <w:keepNext w:val="0"/>
+        <w:spacing w:before="200" w:after="80" w:line="360" w:lineRule="auto"/>
+        <w:jc w:val="left"/>
+      </w:pPr>
+      <w:r>
+        <w:rPr>
+          <w:rFonts w:ascii="Times New Roman" w:hAnsi="Times New Roman" w:eastAsia="黑体"/>
+          <w:b/>
+          <w:sz w:val="44"/>
+        </w:rPr>
+        <w:t>三、团队分工</w:t>
+      </w:r>
+      <w:bookmarkEnd w:id="1003"/>
+    </w:p>
+    <w:p>
+      <w:pPr>
+        <w:spacing w:line="360" w:lineRule="auto" w:before="0" w:after="0"/>
+        <w:jc w:val="both"/>
+        <w:ind w:firstLineChars="200"/>
+      </w:pPr>
+      <w:r>
+        <w:rPr>
+          <w:rFonts w:ascii="Times New Roman" w:hAnsi="Times New Roman" w:eastAsia="宋体"/>
+          <w:b w:val="0"/>
+          <w:sz w:val="24"/>
+        </w:rPr>
+        <w:t>团队5人，角色和职责如下。指导教师（某老师）筹和对外对接，节奏把控、里程碑验收、外部合作洽谈都归这一岗，同时负责把各方信息汇总成统一口径。</w:t>
+      </w:r>
+    </w:p>
+    <w:p>
+      <w:pPr>
+        <w:spacing w:line="360" w:lineRule="auto" w:before="0" w:after="0"/>
+        <w:jc w:val="both"/>
+        <w:ind w:firstLineChars="200"/>
+      </w:pPr>
+      <w:r>
+        <w:rPr>
+          <w:rFonts w:ascii="Times New Roman" w:hAnsi="Times New Roman" w:eastAsia="宋体"/>
+          <w:b w:val="0"/>
+          <w:sz w:val="24"/>
+        </w:rPr>
+        <w:t>技术岗负责产品原型与技术实现，从原型到生成引擎到素材库接入，开发链路整条归他。市场岗负责用户调研、渠道与定价，860条样本（实测值）的调研设计、回收、分析由这一岗牵头，渠道协议和定价方案也在这一岗。</w:t>
+      </w:r>
+    </w:p>
+    <w:p>
+      <w:pPr>
+        <w:spacing w:line="360" w:lineRule="auto" w:before="0" w:after="0"/>
+        <w:jc w:val="both"/>
+        <w:ind w:firstLineChars="200"/>
+      </w:pPr>
+      <w:r>
+        <w:rPr>
+          <w:rFonts w:ascii="Times New Roman" w:hAnsi="Times New Roman" w:eastAsia="宋体"/>
+          <w:b w:val="0"/>
+          <w:sz w:val="24"/>
+        </w:rPr>
+        <w:t>运营与财务岗负责成本测算、收支与落地推进，素材库授权成本、服务器成本、人力成本要算清楚，落地推进指内测场景的协调执行。第五人按项目实际需要补位，前期协助市场做调研执行，后期协助运营做落地推进，具体分工由指导教师（某老师）1周排定。</w:t>
+      </w:r>
+    </w:p>
+    <w:p>
+      <w:bookmarkStart w:id="1004" w:name="_toc_4"/>
+      <w:pPr>
+        <w:pStyle w:val="Heading1"/>
+        <w:keepNext w:val="0"/>
+        <w:spacing w:before="200" w:after="80" w:line="360" w:lineRule="auto"/>
+        <w:jc w:val="left"/>
+      </w:pPr>
+      <w:r>
+        <w:rPr>
+          <w:rFonts w:ascii="Times New Roman" w:hAnsi="Times New Roman" w:eastAsia="黑体"/>
+          <w:b/>
+          <w:sz w:val="44"/>
+        </w:rPr>
+        <w:t>四、风险预案</w:t>
+      </w:r>
+      <w:bookmarkEnd w:id="1004"/>
+    </w:p>
+    <w:p>
+      <w:pPr>
+        <w:spacing w:line="360" w:lineRule="auto" w:before="0" w:after="0"/>
+        <w:jc w:val="both"/>
+        <w:ind w:firstLineChars="200"/>
+      </w:pPr>
+      <w:r>
+        <w:rPr>
+          <w:rFonts w:ascii="Times New Roman" w:hAnsi="Times New Roman" w:eastAsia="宋体"/>
+          <w:b w:val="0"/>
+          <w:sz w:val="24"/>
+        </w:rPr>
+        <w:t>最大的风险是延期。8周排期里，开发占4周，内测占1周，任何一环拖两天，后面就挤。</w:t>
+      </w:r>
+    </w:p>
+    <w:p>
+      <w:pPr>
+        <w:spacing w:line="360" w:lineRule="auto" w:before="0" w:after="0"/>
+        <w:jc w:val="both"/>
+        <w:ind w:firstLineChars="200"/>
+      </w:pPr>
+      <w:r>
+        <w:rPr>
+          <w:rFonts w:ascii="Times New Roman" w:hAnsi="Times New Roman" w:eastAsia="宋体"/>
+          <w:b w:val="0"/>
+          <w:sz w:val="24"/>
+        </w:rPr>
+        <w:t>延期预案分三档。拖3天以内，压缩第7周渠道对接的并行时间，定价验证改为一对一访谈，不铺量。拖3到7天，砍掉非核心文档类型的生成支持，先保主场景，第8周答辩材料同步准备不等待。拖7天以上，启动功能降级方案：素材库先接最小可用集，版权校验保留，生成引擎保主链路，其余功能列入二期。降级方案要在第2周就写好，不能等出事再想。</w:t>
+      </w:r>
+    </w:p>
+    <w:p>
+      <w:pPr>
+        <w:spacing w:line="360" w:lineRule="auto" w:before="0" w:after="0"/>
+        <w:jc w:val="both"/>
+        <w:ind w:firstLineChars="200"/>
+      </w:pPr>
+      <w:r>
+        <w:rPr>
+          <w:rFonts w:ascii="Times New Roman" w:hAnsi="Times New Roman" w:eastAsia="宋体"/>
+          <w:b w:val="0"/>
+          <w:sz w:val="24"/>
+        </w:rPr>
+        <w:t>第二个风险是素材库授权谈不下来。应对是第1周同时接触两家以上素材方，授权方案做A/B两套，A套全量授权、B套按调用量计费，哪套先落地用哪套。</w:t>
+      </w:r>
+    </w:p>
+    <w:p>
+      <w:pPr>
+        <w:spacing w:line="360" w:lineRule="auto" w:before="0" w:after="0"/>
+        <w:jc w:val="both"/>
+        <w:ind w:firstLineChars="200"/>
+      </w:pPr>
+      <w:r>
+        <w:rPr>
+          <w:rFonts w:ascii="Times New Roman" w:hAnsi="Times New Roman" w:eastAsia="宋体"/>
+          <w:b w:val="0"/>
+          <w:sz w:val="24"/>
+        </w:rPr>
+        <w:t>第三个风险是内测样本质量不达标。860条（实测值）如果有效样本占比低于七成，就延长内测3天并追加定向邀请，不拿无效样本充数。</w:t>
+      </w:r>
+    </w:p>
+    <w:p>
+      <w:pPr>
+        <w:spacing w:line="360" w:lineRule="auto" w:before="0" w:after="0"/>
+        <w:jc w:val="both"/>
+        <w:ind w:firstLineChars="200"/>
+      </w:pPr>
+      <w:r>
+        <w:rPr>
+          <w:rFonts w:ascii="Times New Roman" w:hAnsi="Times New Roman" w:eastAsia="宋体"/>
+          <w:b w:val="0"/>
+          <w:sz w:val="24"/>
+        </w:rPr>
+        <w:t>本材料由智能助手辅助起草，已按官方要求排版，请以团队真实情况核对补充后提交。</w:t>
       </w:r>
     </w:p>
     <w:sectPr>
-      <w:pgSz w:w="12240" w:h="15840"/>
-      <w:pgMar w:top="1417" w:right="1587" w:bottom="1417" w:left="1587" w:header="720" w:footer="720" w:gutter="0"/>
+      <w:footerReference w:type="default" r:id="rId9"/>
+      <w:headerReference w:type="default" r:id="rId10"/>
+      <w:pgSz w:w="11906" w:h="16838"/>
+      <w:pgMar w:top="1440" w:right="1797" w:bottom="1440" w:left="1797" w:header="850" w:footer="850" w:gutter="0"/>
       <w:cols w:space="720"/>
+      <w:titlePg/>
       <w:docGrid w:linePitch="360"/>
     </w:sectPr>
   </w:body>
 </w:document>
+</file>
+
+<file path=word/footer1.xml><?xml version="1.0" encoding="utf-8"?>
+<w:ftr xmlns:m="http://schemas.openxmlformats.org/officeDocument/2006/math" xmlns:mc="http://schemas.openxmlformats.org/markup-compatibility/2006" xmlns:mo="http://schemas.microsoft.com/office/mac/office/2008/main" xmlns:mv="urn:schemas-microsoft-com:mac:vml" xmlns:o="urn:schemas-microsoft-com:office:office" xmlns:r="http://schemas.openxmlformats.org/officeDocument/2006/relationships" xmlns:v="urn:schemas-microsoft-com:vml" xmlns:w10="urn:schemas-microsoft-com:office:word" xmlns:w14="http://schemas.microsoft.com/office/word/2010/wordml" xmlns:w="http://schemas.openxmlformats.org/wordprocessingml/2006/main" xmlns:wne="http://schemas.microsoft.com/office/word/2006/wordml" xmlns:wp14="http://schemas.microsoft.com/office/word/2010/wordprocessingDrawing" xmlns:wp="http://schemas.openxmlformats.org/drawingml/2006/wordprocessingDrawing" xmlns:wpc="http://schemas.microsoft.com/office/word/2010/wordprocessingCanvas" xmlns:wpg="http://schemas.microsoft.com/office/word/2010/wordprocessingGroup" xmlns:wpi="http://schemas.microsoft.com/office/word/2010/wordprocessingInk" xmlns:wps="http://schemas.microsoft.com/office/word/2010/wordprocessingShape" mc:Ignorable="w14 wp14">
+  <w:p>
+    <w:pPr>
+      <w:pStyle w:val="Footer"/>
+      <w:jc w:val="center"/>
+    </w:pPr>
+    <w:r>
+      <w:rPr>
+        <w:rFonts w:ascii="Times New Roman" w:hAnsi="Times New Roman" w:eastAsia="宋体"/>
+        <w:b w:val="0"/>
+        <w:sz w:val="21"/>
+      </w:rPr>
+      <w:t xml:space="preserve">— </w:t>
+    </w:r>
+    <w:fldSimple w:instr="PAGE  \* MERGEFORMAT">
+      <w:r>
+        <w:rPr>
+          <w:sz w:val="21"/>
+        </w:rPr>
+        <w:t>1</w:t>
+      </w:r>
+    </w:fldSimple>
+    <w:r>
+      <w:rPr>
+        <w:rFonts w:ascii="Times New Roman" w:hAnsi="Times New Roman" w:eastAsia="宋体"/>
+        <w:b w:val="0"/>
+        <w:sz w:val="21"/>
+      </w:rPr>
+      <w:t xml:space="preserve"> —</w:t>
+    </w:r>
+  </w:p>
+</w:ftr>
+</file>
+
+<file path=word/header1.xml><?xml version="1.0" encoding="utf-8"?>
+<w:hdr xmlns:m="http://schemas.openxmlformats.org/officeDocument/2006/math" xmlns:mc="http://schemas.openxmlformats.org/markup-compatibility/2006" xmlns:mo="http://schemas.microsoft.com/office/mac/office/2008/main" xmlns:mv="urn:schemas-microsoft-com:mac:vml" xmlns:o="urn:schemas-microsoft-com:office:office" xmlns:r="http://schemas.openxmlformats.org/officeDocument/2006/relationships" xmlns:v="urn:schemas-microsoft-com:vml" xmlns:w10="urn:schemas-microsoft-com:office:word" xmlns:w14="http://schemas.microsoft.com/office/word/2010/wordml" xmlns:w="http://schemas.openxmlformats.org/wordprocessingml/2006/main" xmlns:wne="http://schemas.microsoft.com/office/word/2006/wordml" xmlns:wp14="http://schemas.microsoft.com/office/word/2010/wordprocessingDrawing" xmlns:wp="http://schemas.openxmlformats.org/drawingml/2006/wordprocessingDrawing" xmlns:wpc="http://schemas.microsoft.com/office/word/2010/wordprocessingCanvas" xmlns:wpg="http://schemas.microsoft.com/office/word/2010/wordprocessingGroup" xmlns:wpi="http://schemas.microsoft.com/office/word/2010/wordprocessingInk" xmlns:wps="http://schemas.microsoft.com/office/word/2010/wordprocessingShape" mc:Ignorable="w14 wp14">
+  <w:p>
+    <w:pPr>
+      <w:pStyle w:val="Header"/>
+      <w:spacing w:after="0" w:line="240" w:lineRule="auto"/>
+      <w:jc w:val="center"/>
+    </w:pPr>
+    <w:r>
+      <w:rPr>
+        <w:rFonts w:ascii="Times New Roman" w:hAnsi="Times New Roman" w:eastAsia="宋体"/>
+        <w:b w:val="0"/>
+        <w:sz w:val="21"/>
+      </w:rPr>
+      <w:t>实施计划</w:t>
+    </w:r>
+  </w:p>
+</w:hdr>
 </file>
 
 <file path=word/numbering.xml><?xml version="1.0" encoding="utf-8"?>
@@ -414,9 +1281,12 @@
     <w:name w:val="Normal"/>
     <w:qFormat/>
     <w:rsid w:val="00FC693F"/>
+    <w:pPr>
+      <w:spacing w:line="360" w:lineRule="auto" w:before="0" w:after="0"/>
+    </w:pPr>
     <w:rPr>
-      <w:rFonts w:ascii="微软雅黑" w:hAnsi="微软雅黑"/>
-      <w:sz w:val="22"/>
+      <w:rFonts w:ascii="Times New Roman" w:hAnsi="Times New Roman" w:eastAsia="宋体"/>
+      <w:sz w:val="24"/>
     </w:rPr>
   </w:style>
   <w:style w:type="paragraph" w:styleId="Header">
@@ -472,18 +1342,21 @@
     <w:qFormat/>
     <w:rsid w:val="00FC693F"/>
     <w:pPr>
-      <w:keepNext/>
+      <w:keepNext w:val="0"/>
       <w:keepLines/>
-      <w:spacing w:before="480" w:after="0"/>
+      <w:spacing w:before="200" w:after="80" w:line="360" w:lineRule="auto"/>
+      <w:ind w:left="0" w:firstLine="0"/>
       <w:outlineLvl w:val="0"/>
     </w:pPr>
     <w:rPr>
-      <w:rFonts w:asciiTheme="majorHAnsi" w:eastAsiaTheme="majorEastAsia" w:hAnsiTheme="majorHAnsi" w:cstheme="majorBidi"/>
+      <w:rFonts w:asciiTheme="majorHAnsi" w:eastAsiaTheme="majorEastAsia" w:hAnsiTheme="majorHAnsi" w:cstheme="majorBidi" w:ascii="Times New Roman" w:hAnsi="Times New Roman" w:eastAsia="黑体"/>
       <w:b/>
       <w:bCs/>
-      <w:color w:val="365F91" w:themeColor="accent1" w:themeShade="BF"/>
-      <w:sz w:val="28"/>
+      <w:i w:val="0"/>
+      <w:color w:val="000000"/>
+      <w:sz w:val="44"/>
       <w:szCs w:val="28"/>
+      <w:u w:val="none"/>
     </w:rPr>
   </w:style>
   <w:style w:type="paragraph" w:styleId="Heading2">
@@ -498,16 +1371,19 @@
     <w:pPr>
       <w:keepNext/>
       <w:keepLines/>
-      <w:spacing w:before="200" w:after="0"/>
+      <w:spacing w:before="120" w:after="80" w:line="360" w:lineRule="auto"/>
+      <w:ind w:left="0" w:firstLine="0"/>
       <w:outlineLvl w:val="1"/>
     </w:pPr>
     <w:rPr>
-      <w:rFonts w:asciiTheme="majorHAnsi" w:eastAsiaTheme="majorEastAsia" w:hAnsiTheme="majorHAnsi" w:cstheme="majorBidi"/>
+      <w:rFonts w:asciiTheme="majorHAnsi" w:eastAsiaTheme="majorEastAsia" w:hAnsiTheme="majorHAnsi" w:cstheme="majorBidi" w:ascii="Times New Roman" w:hAnsi="Times New Roman" w:eastAsia="黑体"/>
       <w:b/>
       <w:bCs/>
-      <w:color w:val="4F81BD" w:themeColor="accent1"/>
-      <w:sz w:val="26"/>
+      <w:i w:val="0"/>
+      <w:color w:val="000000"/>
+      <w:sz w:val="30"/>
       <w:szCs w:val="26"/>
+      <w:u w:val="none"/>
     </w:rPr>
   </w:style>
   <w:style w:type="paragraph" w:styleId="Heading3">
@@ -522,14 +1398,18 @@
     <w:pPr>
       <w:keepNext/>
       <w:keepLines/>
-      <w:spacing w:before="200" w:after="0"/>
+      <w:spacing w:before="120" w:after="80" w:line="360" w:lineRule="auto"/>
+      <w:ind w:left="0" w:firstLine="0"/>
       <w:outlineLvl w:val="2"/>
     </w:pPr>
     <w:rPr>
-      <w:rFonts w:asciiTheme="majorHAnsi" w:eastAsiaTheme="majorEastAsia" w:hAnsiTheme="majorHAnsi" w:cstheme="majorBidi"/>
+      <w:rFonts w:asciiTheme="majorHAnsi" w:eastAsiaTheme="majorEastAsia" w:hAnsiTheme="majorHAnsi" w:cstheme="majorBidi" w:ascii="Times New Roman" w:hAnsi="Times New Roman" w:eastAsia="黑体"/>
       <w:b/>
       <w:bCs/>
-      <w:color w:val="4F81BD" w:themeColor="accent1"/>
+      <w:i w:val="0"/>
+      <w:color w:val="000000"/>
+      <w:sz w:val="28"/>
+      <w:u w:val="none"/>
     </w:rPr>
   </w:style>
   <w:style w:type="paragraph" w:styleId="Heading4">
@@ -545,16 +1425,19 @@
     <w:pPr>
       <w:keepNext/>
       <w:keepLines/>
-      <w:spacing w:before="200" w:after="0"/>
+      <w:spacing w:before="120" w:after="80" w:line="360" w:lineRule="auto"/>
+      <w:ind w:left="0" w:firstLine="0"/>
       <w:outlineLvl w:val="3"/>
     </w:pPr>
     <w:rPr>
-      <w:rFonts w:asciiTheme="majorHAnsi" w:eastAsiaTheme="majorEastAsia" w:hAnsiTheme="majorHAnsi" w:cstheme="majorBidi"/>
+      <w:rFonts w:asciiTheme="majorHAnsi" w:eastAsiaTheme="majorEastAsia" w:hAnsiTheme="majorHAnsi" w:cstheme="majorBidi" w:ascii="Times New Roman" w:hAnsi="Times New Roman" w:eastAsia="宋体"/>
       <w:b/>
       <w:bCs/>
-      <w:i/>
+      <w:i w:val="0"/>
       <w:iCs/>
-      <w:color w:val="4F81BD" w:themeColor="accent1"/>
+      <w:color w:val="000000"/>
+      <w:sz w:val="24"/>
+      <w:u w:val="none"/>
     </w:rPr>
   </w:style>
   <w:style w:type="paragraph" w:styleId="Heading5">

</xml_diff>